<commit_message>
Compact empty form paragraphs to prevent signature overflow pages
</commit_message>
<xml_diff>
--- a/examples/talabot.docx
+++ b/examples/talabot.docx
@@ -313,7 +313,7 @@
                 </w:p>
                 <w:p>
                   <w:pPr>
-                    <w:spacing w:line="192" w:lineRule="auto"/>
+                    <w:spacing w:line="20" w:lineRule="exact" w:before="0" w:after="0"/>
                     <w:rPr>
                       <w:rFonts w:ascii="Times New Roman" w:hAnsi="Times New Roman" w:cs="Times New Roman"/>
                       <w:b/>
@@ -321,6 +321,7 @@
                       <w:i/>
                       <w:iCs/>
                       <w:lang w:val="tg-Cyrl-TJ"/>
+                      <w:sz w:val="2"/>
                     </w:rPr>
                   </w:pPr>
                 </w:p>
@@ -332,13 +333,14 @@
                 </w:tcPr>
                 <w:p>
                   <w:pPr>
-                    <w:spacing w:line="192" w:lineRule="auto"/>
-                    <w:jc w:val="center"/>
-                    <w:rPr>
-                      <w:rFonts w:ascii="Times New Roman" w:hAnsi="Times New Roman" w:cs="Times New Roman"/>
-                      <w:b/>
-                      <w:bCs/>
-                      <w:lang w:val="tg-Cyrl-TJ"/>
+                    <w:spacing w:line="20" w:lineRule="exact" w:before="0" w:after="0"/>
+                    <w:jc w:val="center"/>
+                    <w:rPr>
+                      <w:rFonts w:ascii="Times New Roman" w:hAnsi="Times New Roman" w:cs="Times New Roman"/>
+                      <w:b/>
+                      <w:bCs/>
+                      <w:lang w:val="tg-Cyrl-TJ"/>
+                      <w:sz w:val="2"/>
                     </w:rPr>
                   </w:pPr>
                 </w:p>
@@ -416,7 +418,7 @@
                 </w:p>
                 <w:p>
                   <w:pPr>
-                    <w:spacing w:line="192" w:lineRule="auto"/>
+                    <w:spacing w:line="20" w:lineRule="exact" w:before="0" w:after="0"/>
                     <w:rPr>
                       <w:rFonts w:ascii="Times New Roman" w:hAnsi="Times New Roman" w:cs="Times New Roman"/>
                       <w:b/>
@@ -424,6 +426,7 @@
                       <w:i/>
                       <w:iCs/>
                       <w:lang w:val="tg-Cyrl-TJ"/>
+                      <w:sz w:val="2"/>
                     </w:rPr>
                   </w:pPr>
                 </w:p>
@@ -435,13 +438,14 @@
                 </w:tcPr>
                 <w:p>
                   <w:pPr>
-                    <w:spacing w:line="192" w:lineRule="auto"/>
-                    <w:jc w:val="center"/>
-                    <w:rPr>
-                      <w:rFonts w:ascii="Times New Roman" w:hAnsi="Times New Roman" w:cs="Times New Roman"/>
-                      <w:b/>
-                      <w:bCs/>
-                      <w:lang w:val="tg-Cyrl-TJ"/>
+                    <w:spacing w:line="20" w:lineRule="exact" w:before="0" w:after="0"/>
+                    <w:jc w:val="center"/>
+                    <w:rPr>
+                      <w:rFonts w:ascii="Times New Roman" w:hAnsi="Times New Roman" w:cs="Times New Roman"/>
+                      <w:b/>
+                      <w:bCs/>
+                      <w:lang w:val="tg-Cyrl-TJ"/>
+                      <w:sz w:val="2"/>
                     </w:rPr>
                   </w:pPr>
                 </w:p>
@@ -524,13 +528,14 @@
                 </w:tcPr>
                 <w:p>
                   <w:pPr>
-                    <w:spacing w:line="192" w:lineRule="auto"/>
-                    <w:jc w:val="center"/>
-                    <w:rPr>
-                      <w:rFonts w:ascii="Times New Roman" w:hAnsi="Times New Roman" w:cs="Times New Roman"/>
-                      <w:b/>
-                      <w:bCs/>
-                      <w:lang w:val="tg-Cyrl-TJ"/>
+                    <w:spacing w:line="20" w:lineRule="exact" w:before="0" w:after="0"/>
+                    <w:jc w:val="center"/>
+                    <w:rPr>
+                      <w:rFonts w:ascii="Times New Roman" w:hAnsi="Times New Roman" w:cs="Times New Roman"/>
+                      <w:b/>
+                      <w:bCs/>
+                      <w:lang w:val="tg-Cyrl-TJ"/>
+                      <w:sz w:val="2"/>
                     </w:rPr>
                   </w:pPr>
                 </w:p>
@@ -608,7 +613,7 @@
                 </w:p>
                 <w:p>
                   <w:pPr>
-                    <w:spacing w:line="192" w:lineRule="auto"/>
+                    <w:spacing w:line="20" w:lineRule="exact" w:before="0" w:after="0"/>
                     <w:rPr>
                       <w:rFonts w:ascii="Times New Roman" w:hAnsi="Times New Roman" w:cs="Times New Roman"/>
                       <w:b/>
@@ -616,6 +621,7 @@
                       <w:i/>
                       <w:iCs/>
                       <w:lang w:val="tg-Cyrl-TJ"/>
+                      <w:sz w:val="2"/>
                     </w:rPr>
                   </w:pPr>
                 </w:p>
@@ -627,13 +633,14 @@
                 </w:tcPr>
                 <w:p>
                   <w:pPr>
-                    <w:spacing w:line="192" w:lineRule="auto"/>
-                    <w:jc w:val="center"/>
-                    <w:rPr>
-                      <w:rFonts w:ascii="Times New Roman" w:hAnsi="Times New Roman" w:cs="Times New Roman"/>
-                      <w:b/>
-                      <w:bCs/>
-                      <w:lang w:val="tg-Cyrl-TJ"/>
+                    <w:spacing w:line="20" w:lineRule="exact" w:before="0" w:after="0"/>
+                    <w:jc w:val="center"/>
+                    <w:rPr>
+                      <w:rFonts w:ascii="Times New Roman" w:hAnsi="Times New Roman" w:cs="Times New Roman"/>
+                      <w:b/>
+                      <w:bCs/>
+                      <w:lang w:val="tg-Cyrl-TJ"/>
+                      <w:sz w:val="2"/>
                     </w:rPr>
                   </w:pPr>
                 </w:p>
@@ -711,7 +718,7 @@
                 </w:p>
                 <w:p>
                   <w:pPr>
-                    <w:spacing w:line="192" w:lineRule="auto"/>
+                    <w:spacing w:line="20" w:lineRule="exact" w:before="0" w:after="0"/>
                     <w:rPr>
                       <w:rFonts w:ascii="Times New Roman" w:hAnsi="Times New Roman" w:cs="Times New Roman"/>
                       <w:b/>
@@ -719,6 +726,7 @@
                       <w:i/>
                       <w:iCs/>
                       <w:lang w:val="tg-Cyrl-TJ"/>
+                      <w:sz w:val="2"/>
                     </w:rPr>
                   </w:pPr>
                 </w:p>
@@ -730,13 +738,14 @@
                 </w:tcPr>
                 <w:p>
                   <w:pPr>
-                    <w:spacing w:line="192" w:lineRule="auto"/>
-                    <w:jc w:val="center"/>
-                    <w:rPr>
-                      <w:rFonts w:ascii="Times New Roman" w:hAnsi="Times New Roman" w:cs="Times New Roman"/>
-                      <w:b/>
-                      <w:bCs/>
-                      <w:lang w:val="tg-Cyrl-TJ"/>
+                    <w:spacing w:line="20" w:lineRule="exact" w:before="0" w:after="0"/>
+                    <w:jc w:val="center"/>
+                    <w:rPr>
+                      <w:rFonts w:ascii="Times New Roman" w:hAnsi="Times New Roman" w:cs="Times New Roman"/>
+                      <w:b/>
+                      <w:bCs/>
+                      <w:lang w:val="tg-Cyrl-TJ"/>
+                      <w:sz w:val="2"/>
                     </w:rPr>
                   </w:pPr>
                 </w:p>
@@ -819,13 +828,14 @@
                 </w:tcPr>
                 <w:p>
                   <w:pPr>
-                    <w:spacing w:line="192" w:lineRule="auto"/>
-                    <w:jc w:val="center"/>
-                    <w:rPr>
-                      <w:rFonts w:ascii="Times New Roman" w:hAnsi="Times New Roman" w:cs="Times New Roman"/>
-                      <w:b/>
-                      <w:bCs/>
-                      <w:lang w:val="tg-Cyrl-TJ"/>
+                    <w:spacing w:line="20" w:lineRule="exact" w:before="0" w:after="0"/>
+                    <w:jc w:val="center"/>
+                    <w:rPr>
+                      <w:rFonts w:ascii="Times New Roman" w:hAnsi="Times New Roman" w:cs="Times New Roman"/>
+                      <w:b/>
+                      <w:bCs/>
+                      <w:lang w:val="tg-Cyrl-TJ"/>
+                      <w:sz w:val="2"/>
                     </w:rPr>
                   </w:pPr>
                 </w:p>
@@ -908,13 +918,14 @@
                 </w:tcPr>
                 <w:p>
                   <w:pPr>
-                    <w:spacing w:line="192" w:lineRule="auto"/>
-                    <w:jc w:val="center"/>
-                    <w:rPr>
-                      <w:rFonts w:ascii="Times New Roman" w:hAnsi="Times New Roman" w:cs="Times New Roman"/>
-                      <w:b/>
-                      <w:bCs/>
-                      <w:lang w:val="tg-Cyrl-TJ"/>
+                    <w:spacing w:line="20" w:lineRule="exact" w:before="0" w:after="0"/>
+                    <w:jc w:val="center"/>
+                    <w:rPr>
+                      <w:rFonts w:ascii="Times New Roman" w:hAnsi="Times New Roman" w:cs="Times New Roman"/>
+                      <w:b/>
+                      <w:bCs/>
+                      <w:lang w:val="tg-Cyrl-TJ"/>
+                      <w:sz w:val="2"/>
                     </w:rPr>
                   </w:pPr>
                 </w:p>
@@ -997,13 +1008,14 @@
                 </w:tcPr>
                 <w:p>
                   <w:pPr>
-                    <w:spacing w:line="192" w:lineRule="auto"/>
-                    <w:jc w:val="center"/>
-                    <w:rPr>
-                      <w:rFonts w:ascii="Times New Roman" w:hAnsi="Times New Roman" w:cs="Times New Roman"/>
-                      <w:b/>
-                      <w:bCs/>
-                      <w:lang w:val="tg-Cyrl-TJ"/>
+                    <w:spacing w:line="20" w:lineRule="exact" w:before="0" w:after="0"/>
+                    <w:jc w:val="center"/>
+                    <w:rPr>
+                      <w:rFonts w:ascii="Times New Roman" w:hAnsi="Times New Roman" w:cs="Times New Roman"/>
+                      <w:b/>
+                      <w:bCs/>
+                      <w:lang w:val="tg-Cyrl-TJ"/>
+                      <w:sz w:val="2"/>
                     </w:rPr>
                   </w:pPr>
                 </w:p>
@@ -1086,13 +1098,14 @@
                 </w:tcPr>
                 <w:p>
                   <w:pPr>
-                    <w:spacing w:line="192" w:lineRule="auto"/>
-                    <w:jc w:val="center"/>
-                    <w:rPr>
-                      <w:rFonts w:ascii="Times New Roman" w:hAnsi="Times New Roman" w:cs="Times New Roman"/>
-                      <w:b/>
-                      <w:bCs/>
-                      <w:lang w:val="tg-Cyrl-TJ"/>
+                    <w:spacing w:line="20" w:lineRule="exact" w:before="0" w:after="0"/>
+                    <w:jc w:val="center"/>
+                    <w:rPr>
+                      <w:rFonts w:ascii="Times New Roman" w:hAnsi="Times New Roman" w:cs="Times New Roman"/>
+                      <w:b/>
+                      <w:bCs/>
+                      <w:lang w:val="tg-Cyrl-TJ"/>
+                      <w:sz w:val="2"/>
                     </w:rPr>
                   </w:pPr>
                 </w:p>
@@ -1175,13 +1188,14 @@
                 </w:tcPr>
                 <w:p>
                   <w:pPr>
-                    <w:spacing w:line="192" w:lineRule="auto"/>
-                    <w:jc w:val="center"/>
-                    <w:rPr>
-                      <w:rFonts w:ascii="Times New Roman" w:hAnsi="Times New Roman" w:cs="Times New Roman"/>
-                      <w:b/>
-                      <w:bCs/>
-                      <w:lang w:val="tg-Cyrl-TJ"/>
+                    <w:spacing w:line="20" w:lineRule="exact" w:before="0" w:after="0"/>
+                    <w:jc w:val="center"/>
+                    <w:rPr>
+                      <w:rFonts w:ascii="Times New Roman" w:hAnsi="Times New Roman" w:cs="Times New Roman"/>
+                      <w:b/>
+                      <w:bCs/>
+                      <w:lang w:val="tg-Cyrl-TJ"/>
+                      <w:sz w:val="2"/>
                     </w:rPr>
                   </w:pPr>
                 </w:p>
@@ -1264,13 +1278,14 @@
                 </w:tcPr>
                 <w:p>
                   <w:pPr>
-                    <w:spacing w:line="192" w:lineRule="auto"/>
-                    <w:jc w:val="center"/>
-                    <w:rPr>
-                      <w:rFonts w:ascii="Times New Roman" w:hAnsi="Times New Roman" w:cs="Times New Roman"/>
-                      <w:b/>
-                      <w:bCs/>
-                      <w:lang w:val="tg-Cyrl-TJ"/>
+                    <w:spacing w:line="20" w:lineRule="exact" w:before="0" w:after="0"/>
+                    <w:jc w:val="center"/>
+                    <w:rPr>
+                      <w:rFonts w:ascii="Times New Roman" w:hAnsi="Times New Roman" w:cs="Times New Roman"/>
+                      <w:b/>
+                      <w:bCs/>
+                      <w:lang w:val="tg-Cyrl-TJ"/>
+                      <w:sz w:val="2"/>
                     </w:rPr>
                   </w:pPr>
                 </w:p>
@@ -1353,13 +1368,14 @@
                 </w:tcPr>
                 <w:p>
                   <w:pPr>
-                    <w:spacing w:line="192" w:lineRule="auto"/>
-                    <w:jc w:val="center"/>
-                    <w:rPr>
-                      <w:rFonts w:ascii="Times New Roman" w:hAnsi="Times New Roman" w:cs="Times New Roman"/>
-                      <w:b/>
-                      <w:bCs/>
-                      <w:lang w:val="tg-Cyrl-TJ"/>
+                    <w:spacing w:line="20" w:lineRule="exact" w:before="0" w:after="0"/>
+                    <w:jc w:val="center"/>
+                    <w:rPr>
+                      <w:rFonts w:ascii="Times New Roman" w:hAnsi="Times New Roman" w:cs="Times New Roman"/>
+                      <w:b/>
+                      <w:bCs/>
+                      <w:lang w:val="tg-Cyrl-TJ"/>
+                      <w:sz w:val="2"/>
                     </w:rPr>
                   </w:pPr>
                 </w:p>
@@ -1442,13 +1458,14 @@
                 </w:tcPr>
                 <w:p>
                   <w:pPr>
-                    <w:spacing w:line="192" w:lineRule="auto"/>
-                    <w:jc w:val="center"/>
-                    <w:rPr>
-                      <w:rFonts w:ascii="Times New Roman" w:hAnsi="Times New Roman" w:cs="Times New Roman"/>
-                      <w:b/>
-                      <w:bCs/>
-                      <w:lang w:val="tg-Cyrl-TJ"/>
+                    <w:spacing w:line="20" w:lineRule="exact" w:before="0" w:after="0"/>
+                    <w:jc w:val="center"/>
+                    <w:rPr>
+                      <w:rFonts w:ascii="Times New Roman" w:hAnsi="Times New Roman" w:cs="Times New Roman"/>
+                      <w:b/>
+                      <w:bCs/>
+                      <w:lang w:val="tg-Cyrl-TJ"/>
+                      <w:sz w:val="2"/>
                     </w:rPr>
                   </w:pPr>
                 </w:p>
@@ -1531,13 +1548,14 @@
                 </w:tcPr>
                 <w:p>
                   <w:pPr>
-                    <w:spacing w:line="192" w:lineRule="auto"/>
-                    <w:jc w:val="center"/>
-                    <w:rPr>
-                      <w:rFonts w:ascii="Times New Roman" w:hAnsi="Times New Roman" w:cs="Times New Roman"/>
-                      <w:b/>
-                      <w:bCs/>
-                      <w:lang w:val="tg-Cyrl-TJ"/>
+                    <w:spacing w:line="20" w:lineRule="exact" w:before="0" w:after="0"/>
+                    <w:jc w:val="center"/>
+                    <w:rPr>
+                      <w:rFonts w:ascii="Times New Roman" w:hAnsi="Times New Roman" w:cs="Times New Roman"/>
+                      <w:b/>
+                      <w:bCs/>
+                      <w:lang w:val="tg-Cyrl-TJ"/>
+                      <w:sz w:val="2"/>
                     </w:rPr>
                   </w:pPr>
                 </w:p>
@@ -1620,13 +1638,14 @@
                 </w:tcPr>
                 <w:p>
                   <w:pPr>
-                    <w:spacing w:line="192" w:lineRule="auto"/>
-                    <w:jc w:val="center"/>
-                    <w:rPr>
-                      <w:rFonts w:ascii="Times New Roman" w:hAnsi="Times New Roman" w:cs="Times New Roman"/>
-                      <w:b/>
-                      <w:bCs/>
-                      <w:lang w:val="tg-Cyrl-TJ"/>
+                    <w:spacing w:line="20" w:lineRule="exact" w:before="0" w:after="0"/>
+                    <w:jc w:val="center"/>
+                    <w:rPr>
+                      <w:rFonts w:ascii="Times New Roman" w:hAnsi="Times New Roman" w:cs="Times New Roman"/>
+                      <w:b/>
+                      <w:bCs/>
+                      <w:lang w:val="tg-Cyrl-TJ"/>
+                      <w:sz w:val="2"/>
                     </w:rPr>
                   </w:pPr>
                 </w:p>
@@ -1709,13 +1728,14 @@
                 </w:tcPr>
                 <w:p>
                   <w:pPr>
-                    <w:spacing w:line="192" w:lineRule="auto"/>
-                    <w:jc w:val="center"/>
-                    <w:rPr>
-                      <w:rFonts w:ascii="Times New Roman" w:hAnsi="Times New Roman" w:cs="Times New Roman"/>
-                      <w:b/>
-                      <w:bCs/>
-                      <w:lang w:val="tg-Cyrl-TJ"/>
+                    <w:spacing w:line="20" w:lineRule="exact" w:before="0" w:after="0"/>
+                    <w:jc w:val="center"/>
+                    <w:rPr>
+                      <w:rFonts w:ascii="Times New Roman" w:hAnsi="Times New Roman" w:cs="Times New Roman"/>
+                      <w:b/>
+                      <w:bCs/>
+                      <w:lang w:val="tg-Cyrl-TJ"/>
+                      <w:sz w:val="2"/>
                     </w:rPr>
                   </w:pPr>
                 </w:p>
@@ -1798,13 +1818,14 @@
                 </w:tcPr>
                 <w:p>
                   <w:pPr>
-                    <w:spacing w:line="192" w:lineRule="auto"/>
-                    <w:jc w:val="center"/>
-                    <w:rPr>
-                      <w:rFonts w:ascii="Times New Roman" w:hAnsi="Times New Roman" w:cs="Times New Roman"/>
-                      <w:b/>
-                      <w:bCs/>
-                      <w:lang w:val="tg-Cyrl-TJ"/>
+                    <w:spacing w:line="20" w:lineRule="exact" w:before="0" w:after="0"/>
+                    <w:jc w:val="center"/>
+                    <w:rPr>
+                      <w:rFonts w:ascii="Times New Roman" w:hAnsi="Times New Roman" w:cs="Times New Roman"/>
+                      <w:b/>
+                      <w:bCs/>
+                      <w:lang w:val="tg-Cyrl-TJ"/>
+                      <w:sz w:val="2"/>
                     </w:rPr>
                   </w:pPr>
                 </w:p>
@@ -1887,13 +1908,14 @@
                 </w:tcPr>
                 <w:p>
                   <w:pPr>
-                    <w:spacing w:line="192" w:lineRule="auto"/>
-                    <w:jc w:val="center"/>
-                    <w:rPr>
-                      <w:rFonts w:ascii="Times New Roman" w:hAnsi="Times New Roman" w:cs="Times New Roman"/>
-                      <w:b/>
-                      <w:bCs/>
-                      <w:lang w:val="tg-Cyrl-TJ"/>
+                    <w:spacing w:line="20" w:lineRule="exact" w:before="0" w:after="0"/>
+                    <w:jc w:val="center"/>
+                    <w:rPr>
+                      <w:rFonts w:ascii="Times New Roman" w:hAnsi="Times New Roman" w:cs="Times New Roman"/>
+                      <w:b/>
+                      <w:bCs/>
+                      <w:lang w:val="tg-Cyrl-TJ"/>
+                      <w:sz w:val="2"/>
                     </w:rPr>
                   </w:pPr>
                 </w:p>
@@ -1976,13 +1998,14 @@
                 </w:tcPr>
                 <w:p>
                   <w:pPr>
-                    <w:spacing w:line="192" w:lineRule="auto"/>
-                    <w:jc w:val="center"/>
-                    <w:rPr>
-                      <w:rFonts w:ascii="Times New Roman" w:hAnsi="Times New Roman" w:cs="Times New Roman"/>
-                      <w:b/>
-                      <w:bCs/>
-                      <w:lang w:val="tg-Cyrl-TJ"/>
+                    <w:spacing w:line="20" w:lineRule="exact" w:before="0" w:after="0"/>
+                    <w:jc w:val="center"/>
+                    <w:rPr>
+                      <w:rFonts w:ascii="Times New Roman" w:hAnsi="Times New Roman" w:cs="Times New Roman"/>
+                      <w:b/>
+                      <w:bCs/>
+                      <w:lang w:val="tg-Cyrl-TJ"/>
+                      <w:sz w:val="2"/>
                     </w:rPr>
                   </w:pPr>
                 </w:p>
@@ -2065,13 +2088,14 @@
                 </w:tcPr>
                 <w:p>
                   <w:pPr>
-                    <w:spacing w:line="192" w:lineRule="auto"/>
-                    <w:jc w:val="center"/>
-                    <w:rPr>
-                      <w:rFonts w:ascii="Times New Roman" w:hAnsi="Times New Roman" w:cs="Times New Roman"/>
-                      <w:b/>
-                      <w:bCs/>
-                      <w:lang w:val="tg-Cyrl-TJ"/>
+                    <w:spacing w:line="20" w:lineRule="exact" w:before="0" w:after="0"/>
+                    <w:jc w:val="center"/>
+                    <w:rPr>
+                      <w:rFonts w:ascii="Times New Roman" w:hAnsi="Times New Roman" w:cs="Times New Roman"/>
+                      <w:b/>
+                      <w:bCs/>
+                      <w:lang w:val="tg-Cyrl-TJ"/>
+                      <w:sz w:val="2"/>
                     </w:rPr>
                   </w:pPr>
                 </w:p>
@@ -2080,7 +2104,7 @@
           </w:tbl>
           <w:p>
             <w:pPr>
-              <w:spacing w:line="192" w:lineRule="auto"/>
+              <w:spacing w:line="20" w:lineRule="exact" w:before="0" w:after="0"/>
               <w:jc w:val="center"/>
               <w:rPr>
                 <w:rFonts w:ascii="Times New Roman" w:hAnsi="Times New Roman" w:cs="Times New Roman"/>
@@ -2089,6 +2113,7 @@
                 <w:i/>
                 <w:iCs/>
                 <w:lang w:val="tg-Cyrl-TJ"/>
+                <w:sz w:val="2"/>
               </w:rPr>
             </w:pPr>
           </w:p>
@@ -2280,13 +2305,14 @@
                 </w:tcPr>
                 <w:p>
                   <w:pPr>
-                    <w:spacing w:line="192" w:lineRule="auto"/>
-                    <w:jc w:val="center"/>
-                    <w:rPr>
-                      <w:rFonts w:ascii="Times New Roman" w:hAnsi="Times New Roman" w:cs="Times New Roman"/>
-                      <w:b/>
-                      <w:bCs/>
-                      <w:lang w:val="tg-Cyrl-TJ"/>
+                    <w:spacing w:line="20" w:lineRule="exact" w:before="0" w:after="0"/>
+                    <w:jc w:val="center"/>
+                    <w:rPr>
+                      <w:rFonts w:ascii="Times New Roman" w:hAnsi="Times New Roman" w:cs="Times New Roman"/>
+                      <w:b/>
+                      <w:bCs/>
+                      <w:lang w:val="tg-Cyrl-TJ"/>
+                      <w:sz w:val="2"/>
                     </w:rPr>
                   </w:pPr>
                 </w:p>
@@ -2359,7 +2385,7 @@
                 </w:p>
                 <w:p>
                   <w:pPr>
-                    <w:spacing w:line="192" w:lineRule="auto"/>
+                    <w:spacing w:line="20" w:lineRule="exact" w:before="0" w:after="0"/>
                     <w:rPr>
                       <w:rFonts w:ascii="Times New Roman" w:hAnsi="Times New Roman" w:cs="Times New Roman"/>
                       <w:b/>
@@ -2367,6 +2393,7 @@
                       <w:i/>
                       <w:iCs/>
                       <w:lang w:val="tg-Cyrl-TJ"/>
+                      <w:sz w:val="2"/>
                     </w:rPr>
                   </w:pPr>
                 </w:p>
@@ -2377,13 +2404,14 @@
                 </w:tcPr>
                 <w:p>
                   <w:pPr>
-                    <w:spacing w:line="192" w:lineRule="auto"/>
-                    <w:jc w:val="center"/>
-                    <w:rPr>
-                      <w:rFonts w:ascii="Times New Roman" w:hAnsi="Times New Roman" w:cs="Times New Roman"/>
-                      <w:b/>
-                      <w:bCs/>
-                      <w:lang w:val="tg-Cyrl-TJ"/>
+                    <w:spacing w:line="20" w:lineRule="exact" w:before="0" w:after="0"/>
+                    <w:jc w:val="center"/>
+                    <w:rPr>
+                      <w:rFonts w:ascii="Times New Roman" w:hAnsi="Times New Roman" w:cs="Times New Roman"/>
+                      <w:b/>
+                      <w:bCs/>
+                      <w:lang w:val="tg-Cyrl-TJ"/>
+                      <w:sz w:val="2"/>
                     </w:rPr>
                   </w:pPr>
                 </w:p>
@@ -2460,13 +2488,14 @@
                 </w:tcPr>
                 <w:p>
                   <w:pPr>
-                    <w:spacing w:line="192" w:lineRule="auto"/>
-                    <w:jc w:val="center"/>
-                    <w:rPr>
-                      <w:rFonts w:ascii="Times New Roman" w:hAnsi="Times New Roman" w:cs="Times New Roman"/>
-                      <w:b/>
-                      <w:bCs/>
-                      <w:lang w:val="tg-Cyrl-TJ"/>
+                    <w:spacing w:line="20" w:lineRule="exact" w:before="0" w:after="0"/>
+                    <w:jc w:val="center"/>
+                    <w:rPr>
+                      <w:rFonts w:ascii="Times New Roman" w:hAnsi="Times New Roman" w:cs="Times New Roman"/>
+                      <w:b/>
+                      <w:bCs/>
+                      <w:lang w:val="tg-Cyrl-TJ"/>
+                      <w:sz w:val="2"/>
                     </w:rPr>
                   </w:pPr>
                 </w:p>
@@ -2539,7 +2568,7 @@
                 </w:p>
                 <w:p>
                   <w:pPr>
-                    <w:spacing w:line="192" w:lineRule="auto"/>
+                    <w:spacing w:line="20" w:lineRule="exact" w:before="0" w:after="0"/>
                     <w:rPr>
                       <w:rFonts w:ascii="Times New Roman" w:hAnsi="Times New Roman" w:cs="Times New Roman"/>
                       <w:b/>
@@ -2547,6 +2576,7 @@
                       <w:i/>
                       <w:iCs/>
                       <w:lang w:val="tg-Cyrl-TJ"/>
+                      <w:sz w:val="2"/>
                     </w:rPr>
                   </w:pPr>
                 </w:p>
@@ -2557,13 +2587,14 @@
                 </w:tcPr>
                 <w:p>
                   <w:pPr>
-                    <w:spacing w:line="192" w:lineRule="auto"/>
-                    <w:jc w:val="center"/>
-                    <w:rPr>
-                      <w:rFonts w:ascii="Times New Roman" w:hAnsi="Times New Roman" w:cs="Times New Roman"/>
-                      <w:b/>
-                      <w:bCs/>
-                      <w:lang w:val="tg-Cyrl-TJ"/>
+                    <w:spacing w:line="20" w:lineRule="exact" w:before="0" w:after="0"/>
+                    <w:jc w:val="center"/>
+                    <w:rPr>
+                      <w:rFonts w:ascii="Times New Roman" w:hAnsi="Times New Roman" w:cs="Times New Roman"/>
+                      <w:b/>
+                      <w:bCs/>
+                      <w:lang w:val="tg-Cyrl-TJ"/>
+                      <w:sz w:val="2"/>
                     </w:rPr>
                   </w:pPr>
                 </w:p>
@@ -2628,13 +2659,14 @@
                 </w:p>
                 <w:p>
                   <w:pPr>
-                    <w:spacing w:line="192" w:lineRule="auto"/>
-                    <w:jc w:val="center"/>
-                    <w:rPr>
-                      <w:rFonts w:ascii="Times New Roman" w:hAnsi="Times New Roman" w:cs="Times New Roman"/>
-                      <w:b/>
-                      <w:bCs/>
-                      <w:lang w:val="tg-Cyrl-TJ"/>
+                    <w:spacing w:line="20" w:lineRule="exact" w:before="0" w:after="0"/>
+                    <w:jc w:val="center"/>
+                    <w:rPr>
+                      <w:rFonts w:ascii="Times New Roman" w:hAnsi="Times New Roman" w:cs="Times New Roman"/>
+                      <w:b/>
+                      <w:bCs/>
+                      <w:lang w:val="tg-Cyrl-TJ"/>
+                      <w:sz w:val="2"/>
                     </w:rPr>
                   </w:pPr>
                 </w:p>
@@ -2645,13 +2677,14 @@
                 </w:tcPr>
                 <w:p>
                   <w:pPr>
-                    <w:spacing w:line="192" w:lineRule="auto"/>
-                    <w:jc w:val="center"/>
-                    <w:rPr>
-                      <w:rFonts w:ascii="Times New Roman" w:hAnsi="Times New Roman" w:cs="Times New Roman"/>
-                      <w:b/>
-                      <w:bCs/>
-                      <w:lang w:val="tg-Cyrl-TJ"/>
+                    <w:spacing w:line="20" w:lineRule="exact" w:before="0" w:after="0"/>
+                    <w:jc w:val="center"/>
+                    <w:rPr>
+                      <w:rFonts w:ascii="Times New Roman" w:hAnsi="Times New Roman" w:cs="Times New Roman"/>
+                      <w:b/>
+                      <w:bCs/>
+                      <w:lang w:val="tg-Cyrl-TJ"/>
+                      <w:sz w:val="2"/>
                     </w:rPr>
                   </w:pPr>
                 </w:p>
@@ -2693,13 +2726,14 @@
                 </w:tcPr>
                 <w:p>
                   <w:pPr>
-                    <w:spacing w:line="192" w:lineRule="auto"/>
-                    <w:jc w:val="center"/>
-                    <w:rPr>
-                      <w:rFonts w:ascii="Times New Roman" w:hAnsi="Times New Roman" w:cs="Times New Roman"/>
-                      <w:b/>
-                      <w:bCs/>
-                      <w:lang w:val="tg-Cyrl-TJ"/>
+                    <w:spacing w:line="20" w:lineRule="exact" w:before="0" w:after="0"/>
+                    <w:jc w:val="center"/>
+                    <w:rPr>
+                      <w:rFonts w:ascii="Times New Roman" w:hAnsi="Times New Roman" w:cs="Times New Roman"/>
+                      <w:b/>
+                      <w:bCs/>
+                      <w:lang w:val="tg-Cyrl-TJ"/>
+                      <w:sz w:val="2"/>
                     </w:rPr>
                   </w:pPr>
                   <w:r>
@@ -2709,13 +2743,14 @@
                 </w:p>
                 <w:p>
                   <w:pPr>
-                    <w:spacing w:line="192" w:lineRule="auto"/>
-                    <w:jc w:val="center"/>
-                    <w:rPr>
-                      <w:rFonts w:ascii="Times New Roman" w:hAnsi="Times New Roman" w:cs="Times New Roman"/>
-                      <w:b/>
-                      <w:bCs/>
-                      <w:lang w:val="tg-Cyrl-TJ"/>
+                    <w:spacing w:line="20" w:lineRule="exact" w:before="0" w:after="0"/>
+                    <w:jc w:val="center"/>
+                    <w:rPr>
+                      <w:rFonts w:ascii="Times New Roman" w:hAnsi="Times New Roman" w:cs="Times New Roman"/>
+                      <w:b/>
+                      <w:bCs/>
+                      <w:lang w:val="tg-Cyrl-TJ"/>
+                      <w:sz w:val="2"/>
                     </w:rPr>
                   </w:pPr>
                 </w:p>
@@ -2726,13 +2761,14 @@
                 </w:tcPr>
                 <w:p>
                   <w:pPr>
-                    <w:spacing w:line="192" w:lineRule="auto"/>
-                    <w:jc w:val="center"/>
-                    <w:rPr>
-                      <w:rFonts w:ascii="Times New Roman" w:hAnsi="Times New Roman" w:cs="Times New Roman"/>
-                      <w:b/>
-                      <w:bCs/>
-                      <w:lang w:val="tg-Cyrl-TJ"/>
+                    <w:spacing w:line="20" w:lineRule="exact" w:before="0" w:after="0"/>
+                    <w:jc w:val="center"/>
+                    <w:rPr>
+                      <w:rFonts w:ascii="Times New Roman" w:hAnsi="Times New Roman" w:cs="Times New Roman"/>
+                      <w:b/>
+                      <w:bCs/>
+                      <w:lang w:val="tg-Cyrl-TJ"/>
+                      <w:sz w:val="2"/>
                     </w:rPr>
                   </w:pPr>
                 </w:p>
@@ -2774,13 +2810,14 @@
                 </w:tcPr>
                 <w:p>
                   <w:pPr>
-                    <w:spacing w:line="192" w:lineRule="auto"/>
-                    <w:jc w:val="center"/>
-                    <w:rPr>
-                      <w:rFonts w:ascii="Times New Roman" w:hAnsi="Times New Roman" w:cs="Times New Roman"/>
-                      <w:b/>
-                      <w:bCs/>
-                      <w:lang w:val="tg-Cyrl-TJ"/>
+                    <w:spacing w:line="20" w:lineRule="exact" w:before="0" w:after="0"/>
+                    <w:jc w:val="center"/>
+                    <w:rPr>
+                      <w:rFonts w:ascii="Times New Roman" w:hAnsi="Times New Roman" w:cs="Times New Roman"/>
+                      <w:b/>
+                      <w:bCs/>
+                      <w:lang w:val="tg-Cyrl-TJ"/>
+                      <w:sz w:val="2"/>
                     </w:rPr>
                   </w:pPr>
                   <w:r>
@@ -2790,13 +2827,14 @@
                 </w:p>
                 <w:p>
                   <w:pPr>
-                    <w:spacing w:line="192" w:lineRule="auto"/>
-                    <w:jc w:val="center"/>
-                    <w:rPr>
-                      <w:rFonts w:ascii="Times New Roman" w:hAnsi="Times New Roman" w:cs="Times New Roman"/>
-                      <w:b/>
-                      <w:bCs/>
-                      <w:lang w:val="tg-Cyrl-TJ"/>
+                    <w:spacing w:line="20" w:lineRule="exact" w:before="0" w:after="0"/>
+                    <w:jc w:val="center"/>
+                    <w:rPr>
+                      <w:rFonts w:ascii="Times New Roman" w:hAnsi="Times New Roman" w:cs="Times New Roman"/>
+                      <w:b/>
+                      <w:bCs/>
+                      <w:lang w:val="tg-Cyrl-TJ"/>
+                      <w:sz w:val="2"/>
                     </w:rPr>
                   </w:pPr>
                 </w:p>
@@ -2807,13 +2845,14 @@
                 </w:tcPr>
                 <w:p>
                   <w:pPr>
-                    <w:spacing w:line="192" w:lineRule="auto"/>
-                    <w:jc w:val="center"/>
-                    <w:rPr>
-                      <w:rFonts w:ascii="Times New Roman" w:hAnsi="Times New Roman" w:cs="Times New Roman"/>
-                      <w:b/>
-                      <w:bCs/>
-                      <w:lang w:val="tg-Cyrl-TJ"/>
+                    <w:spacing w:line="20" w:lineRule="exact" w:before="0" w:after="0"/>
+                    <w:jc w:val="center"/>
+                    <w:rPr>
+                      <w:rFonts w:ascii="Times New Roman" w:hAnsi="Times New Roman" w:cs="Times New Roman"/>
+                      <w:b/>
+                      <w:bCs/>
+                      <w:lang w:val="tg-Cyrl-TJ"/>
+                      <w:sz w:val="2"/>
                     </w:rPr>
                   </w:pPr>
                 </w:p>
@@ -2855,13 +2894,14 @@
                 </w:tcPr>
                 <w:p>
                   <w:pPr>
-                    <w:spacing w:line="192" w:lineRule="auto"/>
-                    <w:jc w:val="center"/>
-                    <w:rPr>
-                      <w:rFonts w:ascii="Times New Roman" w:hAnsi="Times New Roman" w:cs="Times New Roman"/>
-                      <w:b/>
-                      <w:bCs/>
-                      <w:lang w:val="tg-Cyrl-TJ"/>
+                    <w:spacing w:line="20" w:lineRule="exact" w:before="0" w:after="0"/>
+                    <w:jc w:val="center"/>
+                    <w:rPr>
+                      <w:rFonts w:ascii="Times New Roman" w:hAnsi="Times New Roman" w:cs="Times New Roman"/>
+                      <w:b/>
+                      <w:bCs/>
+                      <w:lang w:val="tg-Cyrl-TJ"/>
+                      <w:sz w:val="2"/>
                     </w:rPr>
                   </w:pPr>
                   <w:r>
@@ -2871,13 +2911,14 @@
                 </w:p>
                 <w:p>
                   <w:pPr>
-                    <w:spacing w:line="192" w:lineRule="auto"/>
-                    <w:jc w:val="center"/>
-                    <w:rPr>
-                      <w:rFonts w:ascii="Times New Roman" w:hAnsi="Times New Roman" w:cs="Times New Roman"/>
-                      <w:b/>
-                      <w:bCs/>
-                      <w:lang w:val="tg-Cyrl-TJ"/>
+                    <w:spacing w:line="20" w:lineRule="exact" w:before="0" w:after="0"/>
+                    <w:jc w:val="center"/>
+                    <w:rPr>
+                      <w:rFonts w:ascii="Times New Roman" w:hAnsi="Times New Roman" w:cs="Times New Roman"/>
+                      <w:b/>
+                      <w:bCs/>
+                      <w:lang w:val="tg-Cyrl-TJ"/>
+                      <w:sz w:val="2"/>
                     </w:rPr>
                   </w:pPr>
                 </w:p>
@@ -2888,13 +2929,14 @@
                 </w:tcPr>
                 <w:p>
                   <w:pPr>
-                    <w:spacing w:line="192" w:lineRule="auto"/>
-                    <w:jc w:val="center"/>
-                    <w:rPr>
-                      <w:rFonts w:ascii="Times New Roman" w:hAnsi="Times New Roman" w:cs="Times New Roman"/>
-                      <w:b/>
-                      <w:bCs/>
-                      <w:lang w:val="tg-Cyrl-TJ"/>
+                    <w:spacing w:line="20" w:lineRule="exact" w:before="0" w:after="0"/>
+                    <w:jc w:val="center"/>
+                    <w:rPr>
+                      <w:rFonts w:ascii="Times New Roman" w:hAnsi="Times New Roman" w:cs="Times New Roman"/>
+                      <w:b/>
+                      <w:bCs/>
+                      <w:lang w:val="tg-Cyrl-TJ"/>
+                      <w:sz w:val="2"/>
                     </w:rPr>
                   </w:pPr>
                 </w:p>
@@ -2936,13 +2978,14 @@
                 </w:tcPr>
                 <w:p>
                   <w:pPr>
-                    <w:spacing w:line="192" w:lineRule="auto"/>
-                    <w:jc w:val="center"/>
-                    <w:rPr>
-                      <w:rFonts w:ascii="Times New Roman" w:hAnsi="Times New Roman" w:cs="Times New Roman"/>
-                      <w:b/>
-                      <w:bCs/>
-                      <w:lang w:val="tg-Cyrl-TJ"/>
+                    <w:spacing w:line="20" w:lineRule="exact" w:before="0" w:after="0"/>
+                    <w:jc w:val="center"/>
+                    <w:rPr>
+                      <w:rFonts w:ascii="Times New Roman" w:hAnsi="Times New Roman" w:cs="Times New Roman"/>
+                      <w:b/>
+                      <w:bCs/>
+                      <w:lang w:val="tg-Cyrl-TJ"/>
+                      <w:sz w:val="2"/>
                     </w:rPr>
                   </w:pPr>
                   <w:r>
@@ -2952,13 +2995,14 @@
                 </w:p>
                 <w:p>
                   <w:pPr>
-                    <w:spacing w:line="192" w:lineRule="auto"/>
-                    <w:jc w:val="center"/>
-                    <w:rPr>
-                      <w:rFonts w:ascii="Times New Roman" w:hAnsi="Times New Roman" w:cs="Times New Roman"/>
-                      <w:b/>
-                      <w:bCs/>
-                      <w:lang w:val="tg-Cyrl-TJ"/>
+                    <w:spacing w:line="20" w:lineRule="exact" w:before="0" w:after="0"/>
+                    <w:jc w:val="center"/>
+                    <w:rPr>
+                      <w:rFonts w:ascii="Times New Roman" w:hAnsi="Times New Roman" w:cs="Times New Roman"/>
+                      <w:b/>
+                      <w:bCs/>
+                      <w:lang w:val="tg-Cyrl-TJ"/>
+                      <w:sz w:val="2"/>
                     </w:rPr>
                   </w:pPr>
                 </w:p>
@@ -2969,13 +3013,14 @@
                 </w:tcPr>
                 <w:p>
                   <w:pPr>
-                    <w:spacing w:line="192" w:lineRule="auto"/>
-                    <w:jc w:val="center"/>
-                    <w:rPr>
-                      <w:rFonts w:ascii="Times New Roman" w:hAnsi="Times New Roman" w:cs="Times New Roman"/>
-                      <w:b/>
-                      <w:bCs/>
-                      <w:lang w:val="tg-Cyrl-TJ"/>
+                    <w:spacing w:line="20" w:lineRule="exact" w:before="0" w:after="0"/>
+                    <w:jc w:val="center"/>
+                    <w:rPr>
+                      <w:rFonts w:ascii="Times New Roman" w:hAnsi="Times New Roman" w:cs="Times New Roman"/>
+                      <w:b/>
+                      <w:bCs/>
+                      <w:lang w:val="tg-Cyrl-TJ"/>
+                      <w:sz w:val="2"/>
                     </w:rPr>
                   </w:pPr>
                 </w:p>
@@ -3017,13 +3062,14 @@
                 </w:tcPr>
                 <w:p>
                   <w:pPr>
-                    <w:spacing w:line="192" w:lineRule="auto"/>
-                    <w:jc w:val="center"/>
-                    <w:rPr>
-                      <w:rFonts w:ascii="Times New Roman" w:hAnsi="Times New Roman" w:cs="Times New Roman"/>
-                      <w:b/>
-                      <w:bCs/>
-                      <w:lang w:val="tg-Cyrl-TJ"/>
+                    <w:spacing w:line="20" w:lineRule="exact" w:before="0" w:after="0"/>
+                    <w:jc w:val="center"/>
+                    <w:rPr>
+                      <w:rFonts w:ascii="Times New Roman" w:hAnsi="Times New Roman" w:cs="Times New Roman"/>
+                      <w:b/>
+                      <w:bCs/>
+                      <w:lang w:val="tg-Cyrl-TJ"/>
+                      <w:sz w:val="2"/>
                     </w:rPr>
                   </w:pPr>
                   <w:r>
@@ -3033,13 +3079,14 @@
                 </w:p>
                 <w:p>
                   <w:pPr>
-                    <w:spacing w:line="192" w:lineRule="auto"/>
-                    <w:jc w:val="center"/>
-                    <w:rPr>
-                      <w:rFonts w:ascii="Times New Roman" w:hAnsi="Times New Roman" w:cs="Times New Roman"/>
-                      <w:b/>
-                      <w:bCs/>
-                      <w:lang w:val="tg-Cyrl-TJ"/>
+                    <w:spacing w:line="20" w:lineRule="exact" w:before="0" w:after="0"/>
+                    <w:jc w:val="center"/>
+                    <w:rPr>
+                      <w:rFonts w:ascii="Times New Roman" w:hAnsi="Times New Roman" w:cs="Times New Roman"/>
+                      <w:b/>
+                      <w:bCs/>
+                      <w:lang w:val="tg-Cyrl-TJ"/>
+                      <w:sz w:val="2"/>
                     </w:rPr>
                   </w:pPr>
                 </w:p>
@@ -3050,13 +3097,14 @@
                 </w:tcPr>
                 <w:p>
                   <w:pPr>
-                    <w:spacing w:line="192" w:lineRule="auto"/>
-                    <w:jc w:val="center"/>
-                    <w:rPr>
-                      <w:rFonts w:ascii="Times New Roman" w:hAnsi="Times New Roman" w:cs="Times New Roman"/>
-                      <w:b/>
-                      <w:bCs/>
-                      <w:lang w:val="tg-Cyrl-TJ"/>
+                    <w:spacing w:line="20" w:lineRule="exact" w:before="0" w:after="0"/>
+                    <w:jc w:val="center"/>
+                    <w:rPr>
+                      <w:rFonts w:ascii="Times New Roman" w:hAnsi="Times New Roman" w:cs="Times New Roman"/>
+                      <w:b/>
+                      <w:bCs/>
+                      <w:lang w:val="tg-Cyrl-TJ"/>
+                      <w:sz w:val="2"/>
                     </w:rPr>
                   </w:pPr>
                 </w:p>
@@ -3098,13 +3146,14 @@
                 </w:tcPr>
                 <w:p>
                   <w:pPr>
-                    <w:spacing w:line="192" w:lineRule="auto"/>
-                    <w:jc w:val="center"/>
-                    <w:rPr>
-                      <w:rFonts w:ascii="Times New Roman" w:hAnsi="Times New Roman" w:cs="Times New Roman"/>
-                      <w:b/>
-                      <w:bCs/>
-                      <w:lang w:val="tg-Cyrl-TJ"/>
+                    <w:spacing w:line="20" w:lineRule="exact" w:before="0" w:after="0"/>
+                    <w:jc w:val="center"/>
+                    <w:rPr>
+                      <w:rFonts w:ascii="Times New Roman" w:hAnsi="Times New Roman" w:cs="Times New Roman"/>
+                      <w:b/>
+                      <w:bCs/>
+                      <w:lang w:val="tg-Cyrl-TJ"/>
+                      <w:sz w:val="2"/>
                     </w:rPr>
                   </w:pPr>
                   <w:r>
@@ -3114,13 +3163,14 @@
                 </w:p>
                 <w:p>
                   <w:pPr>
-                    <w:spacing w:line="192" w:lineRule="auto"/>
-                    <w:jc w:val="center"/>
-                    <w:rPr>
-                      <w:rFonts w:ascii="Times New Roman" w:hAnsi="Times New Roman" w:cs="Times New Roman"/>
-                      <w:b/>
-                      <w:bCs/>
-                      <w:lang w:val="tg-Cyrl-TJ"/>
+                    <w:spacing w:line="20" w:lineRule="exact" w:before="0" w:after="0"/>
+                    <w:jc w:val="center"/>
+                    <w:rPr>
+                      <w:rFonts w:ascii="Times New Roman" w:hAnsi="Times New Roman" w:cs="Times New Roman"/>
+                      <w:b/>
+                      <w:bCs/>
+                      <w:lang w:val="tg-Cyrl-TJ"/>
+                      <w:sz w:val="2"/>
                     </w:rPr>
                   </w:pPr>
                 </w:p>
@@ -3131,13 +3181,14 @@
                 </w:tcPr>
                 <w:p>
                   <w:pPr>
-                    <w:spacing w:line="192" w:lineRule="auto"/>
+                    <w:spacing w:line="20" w:lineRule="exact" w:before="0" w:after="0"/>
                     <w:jc w:val="right"/>
                     <w:rPr>
                       <w:rFonts w:ascii="Times New Roman" w:hAnsi="Times New Roman" w:cs="Times New Roman"/>
                       <w:b/>
                       <w:bCs/>
                       <w:lang w:val="tg-Cyrl-TJ"/>
+                      <w:sz w:val="2"/>
                     </w:rPr>
                   </w:pPr>
                 </w:p>
@@ -3179,13 +3230,14 @@
                 </w:tcPr>
                 <w:p>
                   <w:pPr>
-                    <w:spacing w:line="192" w:lineRule="auto"/>
-                    <w:jc w:val="center"/>
-                    <w:rPr>
-                      <w:rFonts w:ascii="Times New Roman" w:hAnsi="Times New Roman" w:cs="Times New Roman"/>
-                      <w:b/>
-                      <w:bCs/>
-                      <w:lang w:val="tg-Cyrl-TJ"/>
+                    <w:spacing w:line="20" w:lineRule="exact" w:before="0" w:after="0"/>
+                    <w:jc w:val="center"/>
+                    <w:rPr>
+                      <w:rFonts w:ascii="Times New Roman" w:hAnsi="Times New Roman" w:cs="Times New Roman"/>
+                      <w:b/>
+                      <w:bCs/>
+                      <w:lang w:val="tg-Cyrl-TJ"/>
+                      <w:sz w:val="2"/>
                     </w:rPr>
                   </w:pPr>
                   <w:r>
@@ -3195,13 +3247,14 @@
                 </w:p>
                 <w:p>
                   <w:pPr>
-                    <w:spacing w:line="192" w:lineRule="auto"/>
-                    <w:jc w:val="center"/>
-                    <w:rPr>
-                      <w:rFonts w:ascii="Times New Roman" w:hAnsi="Times New Roman" w:cs="Times New Roman"/>
-                      <w:b/>
-                      <w:bCs/>
-                      <w:lang w:val="tg-Cyrl-TJ"/>
+                    <w:spacing w:line="20" w:lineRule="exact" w:before="0" w:after="0"/>
+                    <w:jc w:val="center"/>
+                    <w:rPr>
+                      <w:rFonts w:ascii="Times New Roman" w:hAnsi="Times New Roman" w:cs="Times New Roman"/>
+                      <w:b/>
+                      <w:bCs/>
+                      <w:lang w:val="tg-Cyrl-TJ"/>
+                      <w:sz w:val="2"/>
                     </w:rPr>
                   </w:pPr>
                 </w:p>
@@ -3212,13 +3265,14 @@
                 </w:tcPr>
                 <w:p>
                   <w:pPr>
-                    <w:spacing w:line="192" w:lineRule="auto"/>
-                    <w:jc w:val="center"/>
-                    <w:rPr>
-                      <w:rFonts w:ascii="Times New Roman" w:hAnsi="Times New Roman" w:cs="Times New Roman"/>
-                      <w:b/>
-                      <w:bCs/>
-                      <w:lang w:val="tg-Cyrl-TJ"/>
+                    <w:spacing w:line="20" w:lineRule="exact" w:before="0" w:after="0"/>
+                    <w:jc w:val="center"/>
+                    <w:rPr>
+                      <w:rFonts w:ascii="Times New Roman" w:hAnsi="Times New Roman" w:cs="Times New Roman"/>
+                      <w:b/>
+                      <w:bCs/>
+                      <w:lang w:val="tg-Cyrl-TJ"/>
+                      <w:sz w:val="2"/>
                     </w:rPr>
                   </w:pPr>
                 </w:p>
@@ -3260,13 +3314,14 @@
                 </w:tcPr>
                 <w:p>
                   <w:pPr>
-                    <w:spacing w:line="192" w:lineRule="auto"/>
-                    <w:jc w:val="center"/>
-                    <w:rPr>
-                      <w:rFonts w:ascii="Times New Roman" w:hAnsi="Times New Roman" w:cs="Times New Roman"/>
-                      <w:b/>
-                      <w:bCs/>
-                      <w:lang w:val="tg-Cyrl-TJ"/>
+                    <w:spacing w:line="20" w:lineRule="exact" w:before="0" w:after="0"/>
+                    <w:jc w:val="center"/>
+                    <w:rPr>
+                      <w:rFonts w:ascii="Times New Roman" w:hAnsi="Times New Roman" w:cs="Times New Roman"/>
+                      <w:b/>
+                      <w:bCs/>
+                      <w:lang w:val="tg-Cyrl-TJ"/>
+                      <w:sz w:val="2"/>
                     </w:rPr>
                   </w:pPr>
                   <w:r>
@@ -3276,13 +3331,14 @@
                 </w:p>
                 <w:p>
                   <w:pPr>
-                    <w:spacing w:line="192" w:lineRule="auto"/>
-                    <w:jc w:val="center"/>
-                    <w:rPr>
-                      <w:rFonts w:ascii="Times New Roman" w:hAnsi="Times New Roman" w:cs="Times New Roman"/>
-                      <w:b/>
-                      <w:bCs/>
-                      <w:lang w:val="tg-Cyrl-TJ"/>
+                    <w:spacing w:line="20" w:lineRule="exact" w:before="0" w:after="0"/>
+                    <w:jc w:val="center"/>
+                    <w:rPr>
+                      <w:rFonts w:ascii="Times New Roman" w:hAnsi="Times New Roman" w:cs="Times New Roman"/>
+                      <w:b/>
+                      <w:bCs/>
+                      <w:lang w:val="tg-Cyrl-TJ"/>
+                      <w:sz w:val="2"/>
                     </w:rPr>
                   </w:pPr>
                 </w:p>
@@ -3293,13 +3349,14 @@
                 </w:tcPr>
                 <w:p>
                   <w:pPr>
-                    <w:spacing w:line="192" w:lineRule="auto"/>
-                    <w:jc w:val="center"/>
-                    <w:rPr>
-                      <w:rFonts w:ascii="Times New Roman" w:hAnsi="Times New Roman" w:cs="Times New Roman"/>
-                      <w:b/>
-                      <w:bCs/>
-                      <w:lang w:val="tg-Cyrl-TJ"/>
+                    <w:spacing w:line="20" w:lineRule="exact" w:before="0" w:after="0"/>
+                    <w:jc w:val="center"/>
+                    <w:rPr>
+                      <w:rFonts w:ascii="Times New Roman" w:hAnsi="Times New Roman" w:cs="Times New Roman"/>
+                      <w:b/>
+                      <w:bCs/>
+                      <w:lang w:val="tg-Cyrl-TJ"/>
+                      <w:sz w:val="2"/>
                     </w:rPr>
                   </w:pPr>
                 </w:p>
@@ -3341,13 +3398,14 @@
                 </w:tcPr>
                 <w:p>
                   <w:pPr>
-                    <w:spacing w:line="192" w:lineRule="auto"/>
-                    <w:jc w:val="center"/>
-                    <w:rPr>
-                      <w:rFonts w:ascii="Times New Roman" w:hAnsi="Times New Roman" w:cs="Times New Roman"/>
-                      <w:b/>
-                      <w:bCs/>
-                      <w:lang w:val="tg-Cyrl-TJ"/>
+                    <w:spacing w:line="20" w:lineRule="exact" w:before="0" w:after="0"/>
+                    <w:jc w:val="center"/>
+                    <w:rPr>
+                      <w:rFonts w:ascii="Times New Roman" w:hAnsi="Times New Roman" w:cs="Times New Roman"/>
+                      <w:b/>
+                      <w:bCs/>
+                      <w:lang w:val="tg-Cyrl-TJ"/>
+                      <w:sz w:val="2"/>
                     </w:rPr>
                   </w:pPr>
                   <w:r>
@@ -3357,13 +3415,14 @@
                 </w:p>
                 <w:p>
                   <w:pPr>
-                    <w:spacing w:line="192" w:lineRule="auto"/>
-                    <w:jc w:val="center"/>
-                    <w:rPr>
-                      <w:rFonts w:ascii="Times New Roman" w:hAnsi="Times New Roman" w:cs="Times New Roman"/>
-                      <w:b/>
-                      <w:bCs/>
-                      <w:lang w:val="tg-Cyrl-TJ"/>
+                    <w:spacing w:line="20" w:lineRule="exact" w:before="0" w:after="0"/>
+                    <w:jc w:val="center"/>
+                    <w:rPr>
+                      <w:rFonts w:ascii="Times New Roman" w:hAnsi="Times New Roman" w:cs="Times New Roman"/>
+                      <w:b/>
+                      <w:bCs/>
+                      <w:lang w:val="tg-Cyrl-TJ"/>
+                      <w:sz w:val="2"/>
                     </w:rPr>
                   </w:pPr>
                 </w:p>
@@ -3374,13 +3433,14 @@
                 </w:tcPr>
                 <w:p>
                   <w:pPr>
-                    <w:spacing w:line="192" w:lineRule="auto"/>
-                    <w:jc w:val="center"/>
-                    <w:rPr>
-                      <w:rFonts w:ascii="Times New Roman" w:hAnsi="Times New Roman" w:cs="Times New Roman"/>
-                      <w:b/>
-                      <w:bCs/>
-                      <w:lang w:val="tg-Cyrl-TJ"/>
+                    <w:spacing w:line="20" w:lineRule="exact" w:before="0" w:after="0"/>
+                    <w:jc w:val="center"/>
+                    <w:rPr>
+                      <w:rFonts w:ascii="Times New Roman" w:hAnsi="Times New Roman" w:cs="Times New Roman"/>
+                      <w:b/>
+                      <w:bCs/>
+                      <w:lang w:val="tg-Cyrl-TJ"/>
+                      <w:sz w:val="2"/>
                     </w:rPr>
                   </w:pPr>
                 </w:p>
@@ -3422,13 +3482,14 @@
                 </w:tcPr>
                 <w:p>
                   <w:pPr>
-                    <w:spacing w:line="192" w:lineRule="auto"/>
-                    <w:jc w:val="center"/>
-                    <w:rPr>
-                      <w:rFonts w:ascii="Times New Roman" w:hAnsi="Times New Roman" w:cs="Times New Roman"/>
-                      <w:b/>
-                      <w:bCs/>
-                      <w:lang w:val="tg-Cyrl-TJ"/>
+                    <w:spacing w:line="20" w:lineRule="exact" w:before="0" w:after="0"/>
+                    <w:jc w:val="center"/>
+                    <w:rPr>
+                      <w:rFonts w:ascii="Times New Roman" w:hAnsi="Times New Roman" w:cs="Times New Roman"/>
+                      <w:b/>
+                      <w:bCs/>
+                      <w:lang w:val="tg-Cyrl-TJ"/>
+                      <w:sz w:val="2"/>
                     </w:rPr>
                   </w:pPr>
                   <w:r>
@@ -3438,13 +3499,14 @@
                 </w:p>
                 <w:p>
                   <w:pPr>
-                    <w:spacing w:line="192" w:lineRule="auto"/>
-                    <w:jc w:val="center"/>
-                    <w:rPr>
-                      <w:rFonts w:ascii="Times New Roman" w:hAnsi="Times New Roman" w:cs="Times New Roman"/>
-                      <w:b/>
-                      <w:bCs/>
-                      <w:lang w:val="tg-Cyrl-TJ"/>
+                    <w:spacing w:line="20" w:lineRule="exact" w:before="0" w:after="0"/>
+                    <w:jc w:val="center"/>
+                    <w:rPr>
+                      <w:rFonts w:ascii="Times New Roman" w:hAnsi="Times New Roman" w:cs="Times New Roman"/>
+                      <w:b/>
+                      <w:bCs/>
+                      <w:lang w:val="tg-Cyrl-TJ"/>
+                      <w:sz w:val="2"/>
                     </w:rPr>
                   </w:pPr>
                 </w:p>
@@ -3455,13 +3517,14 @@
                 </w:tcPr>
                 <w:p>
                   <w:pPr>
-                    <w:spacing w:line="192" w:lineRule="auto"/>
-                    <w:jc w:val="center"/>
-                    <w:rPr>
-                      <w:rFonts w:ascii="Times New Roman" w:hAnsi="Times New Roman" w:cs="Times New Roman"/>
-                      <w:b/>
-                      <w:bCs/>
-                      <w:lang w:val="tg-Cyrl-TJ"/>
+                    <w:spacing w:line="20" w:lineRule="exact" w:before="0" w:after="0"/>
+                    <w:jc w:val="center"/>
+                    <w:rPr>
+                      <w:rFonts w:ascii="Times New Roman" w:hAnsi="Times New Roman" w:cs="Times New Roman"/>
+                      <w:b/>
+                      <w:bCs/>
+                      <w:lang w:val="tg-Cyrl-TJ"/>
+                      <w:sz w:val="2"/>
                     </w:rPr>
                   </w:pPr>
                 </w:p>
@@ -3503,13 +3566,14 @@
                 </w:tcPr>
                 <w:p>
                   <w:pPr>
-                    <w:spacing w:line="192" w:lineRule="auto"/>
-                    <w:jc w:val="center"/>
-                    <w:rPr>
-                      <w:rFonts w:ascii="Times New Roman" w:hAnsi="Times New Roman" w:cs="Times New Roman"/>
-                      <w:b/>
-                      <w:bCs/>
-                      <w:lang w:val="tg-Cyrl-TJ"/>
+                    <w:spacing w:line="20" w:lineRule="exact" w:before="0" w:after="0"/>
+                    <w:jc w:val="center"/>
+                    <w:rPr>
+                      <w:rFonts w:ascii="Times New Roman" w:hAnsi="Times New Roman" w:cs="Times New Roman"/>
+                      <w:b/>
+                      <w:bCs/>
+                      <w:lang w:val="tg-Cyrl-TJ"/>
+                      <w:sz w:val="2"/>
                     </w:rPr>
                   </w:pPr>
                   <w:r>
@@ -3519,13 +3583,14 @@
                 </w:p>
                 <w:p>
                   <w:pPr>
-                    <w:spacing w:line="192" w:lineRule="auto"/>
-                    <w:jc w:val="center"/>
-                    <w:rPr>
-                      <w:rFonts w:ascii="Times New Roman" w:hAnsi="Times New Roman" w:cs="Times New Roman"/>
-                      <w:b/>
-                      <w:bCs/>
-                      <w:lang w:val="tg-Cyrl-TJ"/>
+                    <w:spacing w:line="20" w:lineRule="exact" w:before="0" w:after="0"/>
+                    <w:jc w:val="center"/>
+                    <w:rPr>
+                      <w:rFonts w:ascii="Times New Roman" w:hAnsi="Times New Roman" w:cs="Times New Roman"/>
+                      <w:b/>
+                      <w:bCs/>
+                      <w:lang w:val="tg-Cyrl-TJ"/>
+                      <w:sz w:val="2"/>
                     </w:rPr>
                   </w:pPr>
                 </w:p>
@@ -3536,13 +3601,14 @@
                 </w:tcPr>
                 <w:p>
                   <w:pPr>
-                    <w:spacing w:line="192" w:lineRule="auto"/>
-                    <w:jc w:val="center"/>
-                    <w:rPr>
-                      <w:rFonts w:ascii="Times New Roman" w:hAnsi="Times New Roman" w:cs="Times New Roman"/>
-                      <w:b/>
-                      <w:bCs/>
-                      <w:lang w:val="tg-Cyrl-TJ"/>
+                    <w:spacing w:line="20" w:lineRule="exact" w:before="0" w:after="0"/>
+                    <w:jc w:val="center"/>
+                    <w:rPr>
+                      <w:rFonts w:ascii="Times New Roman" w:hAnsi="Times New Roman" w:cs="Times New Roman"/>
+                      <w:b/>
+                      <w:bCs/>
+                      <w:lang w:val="tg-Cyrl-TJ"/>
+                      <w:sz w:val="2"/>
                     </w:rPr>
                   </w:pPr>
                 </w:p>
@@ -3584,13 +3650,14 @@
                 </w:tcPr>
                 <w:p>
                   <w:pPr>
-                    <w:spacing w:line="192" w:lineRule="auto"/>
-                    <w:jc w:val="center"/>
-                    <w:rPr>
-                      <w:rFonts w:ascii="Times New Roman" w:hAnsi="Times New Roman" w:cs="Times New Roman"/>
-                      <w:b/>
-                      <w:bCs/>
-                      <w:lang w:val="tg-Cyrl-TJ"/>
+                    <w:spacing w:line="20" w:lineRule="exact" w:before="0" w:after="0"/>
+                    <w:jc w:val="center"/>
+                    <w:rPr>
+                      <w:rFonts w:ascii="Times New Roman" w:hAnsi="Times New Roman" w:cs="Times New Roman"/>
+                      <w:b/>
+                      <w:bCs/>
+                      <w:lang w:val="tg-Cyrl-TJ"/>
+                      <w:sz w:val="2"/>
                     </w:rPr>
                   </w:pPr>
                   <w:r>
@@ -3600,13 +3667,14 @@
                 </w:p>
                 <w:p>
                   <w:pPr>
-                    <w:spacing w:line="192" w:lineRule="auto"/>
-                    <w:jc w:val="center"/>
-                    <w:rPr>
-                      <w:rFonts w:ascii="Times New Roman" w:hAnsi="Times New Roman" w:cs="Times New Roman"/>
-                      <w:b/>
-                      <w:bCs/>
-                      <w:lang w:val="tg-Cyrl-TJ"/>
+                    <w:spacing w:line="20" w:lineRule="exact" w:before="0" w:after="0"/>
+                    <w:jc w:val="center"/>
+                    <w:rPr>
+                      <w:rFonts w:ascii="Times New Roman" w:hAnsi="Times New Roman" w:cs="Times New Roman"/>
+                      <w:b/>
+                      <w:bCs/>
+                      <w:lang w:val="tg-Cyrl-TJ"/>
+                      <w:sz w:val="2"/>
                     </w:rPr>
                   </w:pPr>
                 </w:p>
@@ -3617,13 +3685,14 @@
                 </w:tcPr>
                 <w:p>
                   <w:pPr>
-                    <w:spacing w:line="192" w:lineRule="auto"/>
-                    <w:jc w:val="center"/>
-                    <w:rPr>
-                      <w:rFonts w:ascii="Times New Roman" w:hAnsi="Times New Roman" w:cs="Times New Roman"/>
-                      <w:b/>
-                      <w:bCs/>
-                      <w:lang w:val="tg-Cyrl-TJ"/>
+                    <w:spacing w:line="20" w:lineRule="exact" w:before="0" w:after="0"/>
+                    <w:jc w:val="center"/>
+                    <w:rPr>
+                      <w:rFonts w:ascii="Times New Roman" w:hAnsi="Times New Roman" w:cs="Times New Roman"/>
+                      <w:b/>
+                      <w:bCs/>
+                      <w:lang w:val="tg-Cyrl-TJ"/>
+                      <w:sz w:val="2"/>
                     </w:rPr>
                   </w:pPr>
                 </w:p>
@@ -3665,13 +3734,14 @@
                 </w:tcPr>
                 <w:p>
                   <w:pPr>
-                    <w:spacing w:line="192" w:lineRule="auto"/>
-                    <w:jc w:val="center"/>
-                    <w:rPr>
-                      <w:rFonts w:ascii="Times New Roman" w:hAnsi="Times New Roman" w:cs="Times New Roman"/>
-                      <w:b/>
-                      <w:bCs/>
-                      <w:lang w:val="tg-Cyrl-TJ"/>
+                    <w:spacing w:line="20" w:lineRule="exact" w:before="0" w:after="0"/>
+                    <w:jc w:val="center"/>
+                    <w:rPr>
+                      <w:rFonts w:ascii="Times New Roman" w:hAnsi="Times New Roman" w:cs="Times New Roman"/>
+                      <w:b/>
+                      <w:bCs/>
+                      <w:lang w:val="tg-Cyrl-TJ"/>
+                      <w:sz w:val="2"/>
                     </w:rPr>
                   </w:pPr>
                   <w:r>
@@ -3681,13 +3751,14 @@
                 </w:p>
                 <w:p>
                   <w:pPr>
-                    <w:spacing w:line="192" w:lineRule="auto"/>
-                    <w:jc w:val="center"/>
-                    <w:rPr>
-                      <w:rFonts w:ascii="Times New Roman" w:hAnsi="Times New Roman" w:cs="Times New Roman"/>
-                      <w:b/>
-                      <w:bCs/>
-                      <w:lang w:val="tg-Cyrl-TJ"/>
+                    <w:spacing w:line="20" w:lineRule="exact" w:before="0" w:after="0"/>
+                    <w:jc w:val="center"/>
+                    <w:rPr>
+                      <w:rFonts w:ascii="Times New Roman" w:hAnsi="Times New Roman" w:cs="Times New Roman"/>
+                      <w:b/>
+                      <w:bCs/>
+                      <w:lang w:val="tg-Cyrl-TJ"/>
+                      <w:sz w:val="2"/>
                     </w:rPr>
                   </w:pPr>
                 </w:p>
@@ -3698,13 +3769,14 @@
                 </w:tcPr>
                 <w:p>
                   <w:pPr>
-                    <w:spacing w:line="192" w:lineRule="auto"/>
-                    <w:jc w:val="center"/>
-                    <w:rPr>
-                      <w:rFonts w:ascii="Times New Roman" w:hAnsi="Times New Roman" w:cs="Times New Roman"/>
-                      <w:b/>
-                      <w:bCs/>
-                      <w:lang w:val="tg-Cyrl-TJ"/>
+                    <w:spacing w:line="20" w:lineRule="exact" w:before="0" w:after="0"/>
+                    <w:jc w:val="center"/>
+                    <w:rPr>
+                      <w:rFonts w:ascii="Times New Roman" w:hAnsi="Times New Roman" w:cs="Times New Roman"/>
+                      <w:b/>
+                      <w:bCs/>
+                      <w:lang w:val="tg-Cyrl-TJ"/>
+                      <w:sz w:val="2"/>
                     </w:rPr>
                   </w:pPr>
                 </w:p>
@@ -3746,13 +3818,14 @@
                 </w:tcPr>
                 <w:p>
                   <w:pPr>
-                    <w:spacing w:line="192" w:lineRule="auto"/>
-                    <w:jc w:val="center"/>
-                    <w:rPr>
-                      <w:rFonts w:ascii="Times New Roman" w:hAnsi="Times New Roman" w:cs="Times New Roman"/>
-                      <w:b/>
-                      <w:bCs/>
-                      <w:lang w:val="tg-Cyrl-TJ"/>
+                    <w:spacing w:line="20" w:lineRule="exact" w:before="0" w:after="0"/>
+                    <w:jc w:val="center"/>
+                    <w:rPr>
+                      <w:rFonts w:ascii="Times New Roman" w:hAnsi="Times New Roman" w:cs="Times New Roman"/>
+                      <w:b/>
+                      <w:bCs/>
+                      <w:lang w:val="tg-Cyrl-TJ"/>
+                      <w:sz w:val="2"/>
                     </w:rPr>
                   </w:pPr>
                   <w:r>
@@ -3762,13 +3835,14 @@
                 </w:p>
                 <w:p>
                   <w:pPr>
-                    <w:spacing w:line="192" w:lineRule="auto"/>
-                    <w:jc w:val="center"/>
-                    <w:rPr>
-                      <w:rFonts w:ascii="Times New Roman" w:hAnsi="Times New Roman" w:cs="Times New Roman"/>
-                      <w:b/>
-                      <w:bCs/>
-                      <w:lang w:val="tg-Cyrl-TJ"/>
+                    <w:spacing w:line="20" w:lineRule="exact" w:before="0" w:after="0"/>
+                    <w:jc w:val="center"/>
+                    <w:rPr>
+                      <w:rFonts w:ascii="Times New Roman" w:hAnsi="Times New Roman" w:cs="Times New Roman"/>
+                      <w:b/>
+                      <w:bCs/>
+                      <w:lang w:val="tg-Cyrl-TJ"/>
+                      <w:sz w:val="2"/>
                     </w:rPr>
                   </w:pPr>
                 </w:p>
@@ -3779,13 +3853,14 @@
                 </w:tcPr>
                 <w:p>
                   <w:pPr>
-                    <w:spacing w:line="192" w:lineRule="auto"/>
-                    <w:jc w:val="center"/>
-                    <w:rPr>
-                      <w:rFonts w:ascii="Times New Roman" w:hAnsi="Times New Roman" w:cs="Times New Roman"/>
-                      <w:b/>
-                      <w:bCs/>
-                      <w:lang w:val="tg-Cyrl-TJ"/>
+                    <w:spacing w:line="20" w:lineRule="exact" w:before="0" w:after="0"/>
+                    <w:jc w:val="center"/>
+                    <w:rPr>
+                      <w:rFonts w:ascii="Times New Roman" w:hAnsi="Times New Roman" w:cs="Times New Roman"/>
+                      <w:b/>
+                      <w:bCs/>
+                      <w:lang w:val="tg-Cyrl-TJ"/>
+                      <w:sz w:val="2"/>
                     </w:rPr>
                   </w:pPr>
                 </w:p>
@@ -3827,13 +3902,14 @@
                 </w:tcPr>
                 <w:p>
                   <w:pPr>
-                    <w:spacing w:line="192" w:lineRule="auto"/>
-                    <w:jc w:val="center"/>
-                    <w:rPr>
-                      <w:rFonts w:ascii="Times New Roman" w:hAnsi="Times New Roman" w:cs="Times New Roman"/>
-                      <w:b/>
-                      <w:bCs/>
-                      <w:lang w:val="tg-Cyrl-TJ"/>
+                    <w:spacing w:line="20" w:lineRule="exact" w:before="0" w:after="0"/>
+                    <w:jc w:val="center"/>
+                    <w:rPr>
+                      <w:rFonts w:ascii="Times New Roman" w:hAnsi="Times New Roman" w:cs="Times New Roman"/>
+                      <w:b/>
+                      <w:bCs/>
+                      <w:lang w:val="tg-Cyrl-TJ"/>
+                      <w:sz w:val="2"/>
                     </w:rPr>
                   </w:pPr>
                   <w:r>
@@ -3843,13 +3919,14 @@
                 </w:p>
                 <w:p>
                   <w:pPr>
-                    <w:spacing w:line="192" w:lineRule="auto"/>
-                    <w:jc w:val="center"/>
-                    <w:rPr>
-                      <w:rFonts w:ascii="Times New Roman" w:hAnsi="Times New Roman" w:cs="Times New Roman"/>
-                      <w:b/>
-                      <w:bCs/>
-                      <w:lang w:val="tg-Cyrl-TJ"/>
+                    <w:spacing w:line="20" w:lineRule="exact" w:before="0" w:after="0"/>
+                    <w:jc w:val="center"/>
+                    <w:rPr>
+                      <w:rFonts w:ascii="Times New Roman" w:hAnsi="Times New Roman" w:cs="Times New Roman"/>
+                      <w:b/>
+                      <w:bCs/>
+                      <w:lang w:val="tg-Cyrl-TJ"/>
+                      <w:sz w:val="2"/>
                     </w:rPr>
                   </w:pPr>
                 </w:p>
@@ -3860,13 +3937,14 @@
                 </w:tcPr>
                 <w:p>
                   <w:pPr>
-                    <w:spacing w:line="192" w:lineRule="auto"/>
-                    <w:jc w:val="center"/>
-                    <w:rPr>
-                      <w:rFonts w:ascii="Times New Roman" w:hAnsi="Times New Roman" w:cs="Times New Roman"/>
-                      <w:b/>
-                      <w:bCs/>
-                      <w:lang w:val="tg-Cyrl-TJ"/>
+                    <w:spacing w:line="20" w:lineRule="exact" w:before="0" w:after="0"/>
+                    <w:jc w:val="center"/>
+                    <w:rPr>
+                      <w:rFonts w:ascii="Times New Roman" w:hAnsi="Times New Roman" w:cs="Times New Roman"/>
+                      <w:b/>
+                      <w:bCs/>
+                      <w:lang w:val="tg-Cyrl-TJ"/>
+                      <w:sz w:val="2"/>
                     </w:rPr>
                   </w:pPr>
                 </w:p>
@@ -3875,7 +3953,7 @@
           </w:tbl>
           <w:p>
             <w:pPr>
-              <w:spacing w:line="192" w:lineRule="auto"/>
+              <w:spacing w:line="20" w:lineRule="exact" w:before="0" w:after="0"/>
               <w:jc w:val="center"/>
               <w:rPr>
                 <w:rFonts w:ascii="Times New Roman" w:hAnsi="Times New Roman" w:cs="Times New Roman"/>
@@ -3884,6 +3962,7 @@
                 <w:i/>
                 <w:iCs/>
                 <w:lang w:val="tg-Cyrl-TJ"/>
+                <w:sz w:val="2"/>
               </w:rPr>
             </w:pPr>
           </w:p>
@@ -3892,7 +3971,7 @@
     </w:tbl>
     <w:p>
       <w:pPr>
-        <w:spacing w:after="0" w:line="192" w:lineRule="auto"/>
+        <w:spacing w:after="0" w:line="20" w:lineRule="exact" w:before="0"/>
         <w:ind w:firstLine="567"/>
         <w:jc w:val="both"/>
         <w:rPr>
@@ -3902,6 +3981,7 @@
           <w:i/>
           <w:iCs/>
           <w:lang w:val="tg-Cyrl-TJ"/>
+          <w:sz w:val="2"/>
         </w:rPr>
       </w:pPr>
     </w:p>
@@ -4001,13 +4081,14 @@
     </w:p>
     <w:p>
       <w:pPr>
-        <w:spacing w:after="0" w:line="240" w:lineRule="auto"/>
+        <w:spacing w:after="0" w:line="20" w:lineRule="exact" w:before="0"/>
         <w:jc w:val="both"/>
         <w:rPr>
           <w:rFonts w:ascii="Times New Roman" w:hAnsi="Times New Roman" w:cs="Times New Roman"/>
           <w:b/>
           <w:bCs/>
           <w:lang w:val="tg-Cyrl-TJ"/>
+          <w:sz w:val="2"/>
         </w:rPr>
       </w:pPr>
     </w:p>
@@ -4206,7 +4287,9 @@
                     <w:rPr>
                       <w:rFonts w:ascii="Times New Roman" w:hAnsi="Times New Roman" w:cs="Times New Roman"/>
                       <w:lang w:val="tg-Cyrl-TJ"/>
-                    </w:rPr>
+                      <w:sz w:val="2"/>
+                    </w:rPr>
+                    <w:spacing w:before="0" w:after="0" w:line="20" w:lineRule="exact"/>
                   </w:pPr>
                 </w:p>
               </w:tc>
@@ -4247,7 +4330,9 @@
                     <w:rPr>
                       <w:rFonts w:ascii="Times New Roman" w:hAnsi="Times New Roman" w:cs="Times New Roman"/>
                       <w:lang w:val="tg-Cyrl-TJ"/>
-                    </w:rPr>
+                      <w:sz w:val="2"/>
+                    </w:rPr>
+                    <w:spacing w:before="0" w:after="0" w:line="20" w:lineRule="exact"/>
                   </w:pPr>
                   <w:r>
                     <w:rPr/>
@@ -4265,7 +4350,9 @@
                     <w:rPr>
                       <w:rFonts w:ascii="Times New Roman" w:hAnsi="Times New Roman" w:cs="Times New Roman"/>
                       <w:lang w:val="tg-Cyrl-TJ"/>
-                    </w:rPr>
+                      <w:sz w:val="2"/>
+                    </w:rPr>
+                    <w:spacing w:before="0" w:after="0" w:line="20" w:lineRule="exact"/>
                   </w:pPr>
                 </w:p>
               </w:tc>
@@ -4306,7 +4393,9 @@
                     <w:rPr>
                       <w:rFonts w:ascii="Times New Roman" w:hAnsi="Times New Roman" w:cs="Times New Roman"/>
                       <w:lang w:val="tg-Cyrl-TJ"/>
-                    </w:rPr>
+                      <w:sz w:val="2"/>
+                    </w:rPr>
+                    <w:spacing w:before="0" w:after="0" w:line="20" w:lineRule="exact"/>
                   </w:pPr>
                   <w:r>
                     <w:rPr/>
@@ -4324,7 +4413,9 @@
                     <w:rPr>
                       <w:rFonts w:ascii="Times New Roman" w:hAnsi="Times New Roman" w:cs="Times New Roman"/>
                       <w:lang w:val="tg-Cyrl-TJ"/>
-                    </w:rPr>
+                      <w:sz w:val="2"/>
+                    </w:rPr>
+                    <w:spacing w:before="0" w:after="0" w:line="20" w:lineRule="exact"/>
                   </w:pPr>
                 </w:p>
               </w:tc>
@@ -4365,7 +4456,9 @@
                     <w:rPr>
                       <w:rFonts w:ascii="Times New Roman" w:hAnsi="Times New Roman" w:cs="Times New Roman"/>
                       <w:lang w:val="tg-Cyrl-TJ"/>
-                    </w:rPr>
+                      <w:sz w:val="2"/>
+                    </w:rPr>
+                    <w:spacing w:before="0" w:after="0" w:line="20" w:lineRule="exact"/>
                   </w:pPr>
                   <w:r>
                     <w:rPr/>
@@ -4383,7 +4476,9 @@
                     <w:rPr>
                       <w:rFonts w:ascii="Times New Roman" w:hAnsi="Times New Roman" w:cs="Times New Roman"/>
                       <w:lang w:val="tg-Cyrl-TJ"/>
-                    </w:rPr>
+                      <w:sz w:val="2"/>
+                    </w:rPr>
+                    <w:spacing w:before="0" w:after="0" w:line="20" w:lineRule="exact"/>
                   </w:pPr>
                 </w:p>
               </w:tc>
@@ -4424,7 +4519,9 @@
                     <w:rPr>
                       <w:rFonts w:ascii="Times New Roman" w:hAnsi="Times New Roman" w:cs="Times New Roman"/>
                       <w:lang w:val="tg-Cyrl-TJ"/>
-                    </w:rPr>
+                      <w:sz w:val="2"/>
+                    </w:rPr>
+                    <w:spacing w:before="0" w:after="0" w:line="20" w:lineRule="exact"/>
                   </w:pPr>
                   <w:r>
                     <w:rPr/>
@@ -4442,7 +4539,9 @@
                     <w:rPr>
                       <w:rFonts w:ascii="Times New Roman" w:hAnsi="Times New Roman" w:cs="Times New Roman"/>
                       <w:lang w:val="tg-Cyrl-TJ"/>
-                    </w:rPr>
+                      <w:sz w:val="2"/>
+                    </w:rPr>
+                    <w:spacing w:before="0" w:after="0" w:line="20" w:lineRule="exact"/>
                   </w:pPr>
                 </w:p>
               </w:tc>
@@ -4454,7 +4553,9 @@
               <w:rPr>
                 <w:rFonts w:ascii="Times New Roman" w:hAnsi="Times New Roman" w:cs="Times New Roman"/>
                 <w:lang w:val="tg-Cyrl-TJ"/>
+                <w:sz w:val="2"/>
               </w:rPr>
+              <w:spacing w:before="0" w:after="0" w:line="20" w:lineRule="exact"/>
             </w:pPr>
           </w:p>
         </w:tc>
@@ -4607,7 +4708,9 @@
                     <w:rPr>
                       <w:rFonts w:ascii="Times New Roman" w:hAnsi="Times New Roman" w:cs="Times New Roman"/>
                       <w:lang w:val="tg-Cyrl-TJ"/>
-                    </w:rPr>
+                      <w:sz w:val="2"/>
+                    </w:rPr>
+                    <w:spacing w:before="0" w:after="0" w:line="20" w:lineRule="exact"/>
                   </w:pPr>
                   <w:r>
                     <w:rPr/>
@@ -4625,7 +4728,9 @@
                     <w:rPr>
                       <w:rFonts w:ascii="Times New Roman" w:hAnsi="Times New Roman" w:cs="Times New Roman"/>
                       <w:lang w:val="tg-Cyrl-TJ"/>
-                    </w:rPr>
+                      <w:sz w:val="2"/>
+                    </w:rPr>
+                    <w:spacing w:before="0" w:after="0" w:line="20" w:lineRule="exact"/>
                   </w:pPr>
                 </w:p>
               </w:tc>
@@ -4666,7 +4771,9 @@
                     <w:rPr>
                       <w:rFonts w:ascii="Times New Roman" w:hAnsi="Times New Roman" w:cs="Times New Roman"/>
                       <w:lang w:val="tg-Cyrl-TJ"/>
-                    </w:rPr>
+                      <w:sz w:val="2"/>
+                    </w:rPr>
+                    <w:spacing w:before="0" w:after="0" w:line="20" w:lineRule="exact"/>
                   </w:pPr>
                   <w:r>
                     <w:rPr/>
@@ -4684,7 +4791,9 @@
                     <w:rPr>
                       <w:rFonts w:ascii="Times New Roman" w:hAnsi="Times New Roman" w:cs="Times New Roman"/>
                       <w:lang w:val="tg-Cyrl-TJ"/>
-                    </w:rPr>
+                      <w:sz w:val="2"/>
+                    </w:rPr>
+                    <w:spacing w:before="0" w:after="0" w:line="20" w:lineRule="exact"/>
                   </w:pPr>
                 </w:p>
               </w:tc>
@@ -4725,7 +4834,9 @@
                     <w:rPr>
                       <w:rFonts w:ascii="Times New Roman" w:hAnsi="Times New Roman" w:cs="Times New Roman"/>
                       <w:lang w:val="tg-Cyrl-TJ"/>
-                    </w:rPr>
+                      <w:sz w:val="2"/>
+                    </w:rPr>
+                    <w:spacing w:before="0" w:after="0" w:line="20" w:lineRule="exact"/>
                   </w:pPr>
                   <w:r>
                     <w:rPr/>
@@ -4743,7 +4854,9 @@
                     <w:rPr>
                       <w:rFonts w:ascii="Times New Roman" w:hAnsi="Times New Roman" w:cs="Times New Roman"/>
                       <w:lang w:val="tg-Cyrl-TJ"/>
-                    </w:rPr>
+                      <w:sz w:val="2"/>
+                    </w:rPr>
+                    <w:spacing w:before="0" w:after="0" w:line="20" w:lineRule="exact"/>
                   </w:pPr>
                 </w:p>
               </w:tc>
@@ -4784,7 +4897,9 @@
                     <w:rPr>
                       <w:rFonts w:ascii="Times New Roman" w:hAnsi="Times New Roman" w:cs="Times New Roman"/>
                       <w:lang w:val="tg-Cyrl-TJ"/>
-                    </w:rPr>
+                      <w:sz w:val="2"/>
+                    </w:rPr>
+                    <w:spacing w:before="0" w:after="0" w:line="20" w:lineRule="exact"/>
                   </w:pPr>
                   <w:r>
                     <w:rPr/>
@@ -4802,7 +4917,9 @@
                     <w:rPr>
                       <w:rFonts w:ascii="Times New Roman" w:hAnsi="Times New Roman" w:cs="Times New Roman"/>
                       <w:lang w:val="tg-Cyrl-TJ"/>
-                    </w:rPr>
+                      <w:sz w:val="2"/>
+                    </w:rPr>
+                    <w:spacing w:before="0" w:after="0" w:line="20" w:lineRule="exact"/>
                   </w:pPr>
                 </w:p>
               </w:tc>
@@ -4843,7 +4960,9 @@
                     <w:rPr>
                       <w:rFonts w:ascii="Times New Roman" w:hAnsi="Times New Roman" w:cs="Times New Roman"/>
                       <w:lang w:val="tg-Cyrl-TJ"/>
-                    </w:rPr>
+                      <w:sz w:val="2"/>
+                    </w:rPr>
+                    <w:spacing w:before="0" w:after="0" w:line="20" w:lineRule="exact"/>
                   </w:pPr>
                   <w:r>
                     <w:rPr/>
@@ -4861,7 +4980,9 @@
                     <w:rPr>
                       <w:rFonts w:ascii="Times New Roman" w:hAnsi="Times New Roman" w:cs="Times New Roman"/>
                       <w:lang w:val="tg-Cyrl-TJ"/>
-                    </w:rPr>
+                      <w:sz w:val="2"/>
+                    </w:rPr>
+                    <w:spacing w:before="0" w:after="0" w:line="20" w:lineRule="exact"/>
                   </w:pPr>
                 </w:p>
               </w:tc>
@@ -4873,7 +4994,9 @@
               <w:rPr>
                 <w:rFonts w:ascii="Times New Roman" w:hAnsi="Times New Roman" w:cs="Times New Roman"/>
                 <w:lang w:val="tg-Cyrl-TJ"/>
+                <w:sz w:val="2"/>
               </w:rPr>
+              <w:spacing w:before="0" w:after="0" w:line="20" w:lineRule="exact"/>
             </w:pPr>
           </w:p>
         </w:tc>
@@ -4889,7 +5012,9 @@
               <w:rPr>
                 <w:rFonts w:ascii="Times New Roman" w:hAnsi="Times New Roman" w:cs="Times New Roman"/>
                 <w:lang w:val="tg-Cyrl-TJ"/>
+                <w:sz w:val="2"/>
               </w:rPr>
+              <w:spacing w:before="0" w:after="0" w:line="20" w:lineRule="exact"/>
             </w:pPr>
             <w:r>
               <w:rPr>
@@ -4935,7 +5060,9 @@
               <w:rPr>
                 <w:rFonts w:ascii="Times New Roman" w:hAnsi="Times New Roman" w:cs="Times New Roman"/>
                 <w:lang w:val="tg-Cyrl-TJ"/>
+                <w:sz w:val="2"/>
               </w:rPr>
+              <w:spacing w:before="0" w:after="0" w:line="20" w:lineRule="exact"/>
             </w:pPr>
           </w:p>
           <w:p>
@@ -4963,7 +5090,9 @@
               <w:rPr>
                 <w:rFonts w:ascii="Times New Roman" w:hAnsi="Times New Roman" w:cs="Times New Roman"/>
                 <w:lang w:val="tg-Cyrl-TJ"/>
+                <w:sz w:val="2"/>
               </w:rPr>
+              <w:spacing w:before="0" w:after="0" w:line="20" w:lineRule="exact"/>
             </w:pPr>
           </w:p>
           <w:p>
@@ -5001,7 +5130,9 @@
                 <w:i/>
                 <w:iCs/>
                 <w:lang w:val="tg-Cyrl-TJ"/>
+                <w:sz w:val="2"/>
               </w:rPr>
+              <w:spacing w:before="0" w:after="0" w:line="20" w:lineRule="exact"/>
             </w:pPr>
           </w:p>
           <w:p>
@@ -5040,7 +5171,9 @@
               <w:rPr>
                 <w:rFonts w:ascii="Times New Roman" w:hAnsi="Times New Roman" w:cs="Times New Roman"/>
                 <w:lang w:val="tg-Cyrl-TJ"/>
+                <w:sz w:val="2"/>
               </w:rPr>
+              <w:spacing w:before="0" w:after="0" w:line="20" w:lineRule="exact"/>
             </w:pPr>
           </w:p>
           <w:p>
@@ -5069,7 +5202,9 @@
               <w:rPr>
                 <w:rFonts w:ascii="Times New Roman" w:hAnsi="Times New Roman" w:cs="Times New Roman"/>
                 <w:lang w:val="tg-Cyrl-TJ"/>
+                <w:sz w:val="2"/>
               </w:rPr>
+              <w:spacing w:before="0" w:after="0" w:line="20" w:lineRule="exact"/>
             </w:pPr>
           </w:p>
           <w:p>
@@ -5095,21 +5230,9 @@
     </w:tbl>
     <w:p>
       <w:pPr>
-        <w:spacing w:after="0" w:line="240" w:lineRule="auto"/>
-        <w:jc w:val="both"/>
+        <w:spacing w:before="0" w:after="0" w:line="20" w:lineRule="exact"/>
         <w:rPr>
-          <w:rFonts w:ascii="Times New Roman" w:hAnsi="Times New Roman" w:cs="Times New Roman"/>
-          <w:lang w:val="tg-Cyrl-TJ"/>
-        </w:rPr>
-      </w:pPr>
-    </w:p>
-    <w:p>
-      <w:pPr>
-        <w:spacing w:after="0" w:line="240" w:lineRule="auto"/>
-        <w:jc w:val="both"/>
-        <w:rPr>
-          <w:rFonts w:ascii="Times New Roman" w:hAnsi="Times New Roman" w:cs="Times New Roman"/>
-          <w:lang w:val="tg-Cyrl-TJ"/>
+          <w:sz w:val="2"/>
         </w:rPr>
       </w:pPr>
     </w:p>

</xml_diff>